<commit_message>
⚖️ Livre blanc corrigé GAMMA-1 + projections + cashback Amazon
</commit_message>
<xml_diff>
--- a/public/documents/REUSS_Whitepaper_v1.0_2026.docx
+++ b/public/documents/REUSS_Whitepaper_v1.0_2026.docx
@@ -2915,7 +2915,7 @@
           <w:sz w:val="22"/>
           <w:szCs w:val="22"/>
         </w:rPr>
-        <w:t xml:space="preserve">GAMMA-1 (Commission Rewards) : Source Amazon (commissions 4-8%) — 50% redistribués en cashback REUSS aux acheteurs</w:t>
+        <w:t>GAMMA-1 (Community Rewards) : Récompenses communautaires financées par les revenus de l'écosystème REUSSITESS®, distribuées indépendamment du programme Amazon Associates</w:t>
       </w:r>
     </w:p>
     <w:p>
@@ -4019,7 +4019,7 @@
           <w:sz w:val="26"/>
           <w:szCs w:val="26"/>
         </w:rPr>
-        <w:t xml:space="preserve">6.2 Cashback Amazon</w:t>
+        <w:t>6.2 Récompenses Communautaires REUSSITESS®</w:t>
       </w:r>
     </w:p>
     <w:p>
@@ -4038,7 +4038,7 @@
           <w:sz w:val="22"/>
           <w:szCs w:val="22"/>
         </w:rPr>
-        <w:t xml:space="preserve">Les commissions Amazon (4-8% sur 26 boutiques actives dans 14 pays) sont partiellement redistribuées en REUSS aux acheteurs qualifiés via GAMMA-1. Cela crée un flux naturel de distribution sans dilution artificielle.</w:t>
+        <w:t>Les revenus générés par l'écosystème REUSSITESS® (boutiques Amazon, GoMining, partenariats) alimentent le vecteur GAMMA-1 pour distribuer des récompenses communautaires en REUSS. Ces récompenses sont attribuées indépendamment du programme Amazon Associates, conformément aux conditions d'utilisation Amazon et au droit de la consommation applicable dans les 14 pays partenaires.</w:t>
       </w:r>
     </w:p>
     <w:p>
@@ -5468,7 +5468,7 @@
           <w:sz w:val="22"/>
           <w:szCs w:val="22"/>
         </w:rPr>
-        <w:t xml:space="preserve">Pool TVL : $100k → $1 000 000</w:t>
+        <w:t>Pool TVL : $100k → $1 000 000 (objectif prévisionnel non garanti)</w:t>
       </w:r>
     </w:p>
     <w:p>
@@ -5487,7 +5487,7 @@
           <w:sz w:val="22"/>
           <w:szCs w:val="22"/>
         </w:rPr>
-        <w:t xml:space="preserve">Prix REUSS : $0.001 → $0.01</w:t>
+        <w:t>Prix REUSS : $0.001 → $0.01 (objectif prévisionnel non garanti)</w:t>
       </w:r>
     </w:p>
     <w:p>
@@ -6617,7 +6617,7 @@
           <w:sz w:val="22"/>
           <w:szCs w:val="22"/>
         </w:rPr>
-        <w:t xml:space="preserve">REUSS est classifié comme Utility Token donnant accès aux services de l'écosystème Reussitess® : cashback Amazon, accès IA, récompenses quiz et gouvernance. La conformité est en cours de mise en place dans les 14 pays opérationnels.</w:t>
+        <w:t>REUSS est classifié comme Utility Token donnant accès aux services de l'écosystème Reussitess® : récompenses communautaires, accès IA, récompenses quiz et gouvernance. La conformité est en cours de mise en place dans les 14 pays opérationnels.</w:t>
       </w:r>
     </w:p>
     <w:p>
@@ -8466,7 +8466,7 @@
           <w:sz w:val="22"/>
           <w:szCs w:val="22"/>
         </w:rPr>
-        <w:t xml:space="preserve">Le token REUSS est un utility token donnant accès aux services de l'écosystème Reussitess® : cashback Amazon, accès à l'IA, récompenses quiz et gouvernance communautaire.</w:t>
+        <w:t>Le token REUSS est un utility token donnant accès aux services de l'écosystème Reussitess® : récompenses communautaires, accès à l'IA NEURO-X, récompenses quiz éducatifs et gouvernance communautaire.</w:t>
       </w:r>
     </w:p>
     <w:p>

</xml_diff>